<commit_message>
docs(library): restyle hand-authored one-offs into QI Report template
- New tools/docx_restyle_qi.py: re-render an existing .docx in the template
  (style-mapped headings/lists/tables, run formatting preserved, image guard).
- Applied to MapSnap IT Components & Licensing, MapSnap Video Script, and the
  QI Ecosystem Tech Stack Reference (companion PDFs regenerated).
- Template: setup_page() header text now overridable for non-status docs.

Co-Authored-By: Claude Fable 5 <noreply@anthropic.com>
</commit_message>
<xml_diff>
--- a/shared/documentation/project_library/MapSnap/MapSnap_Video_Script_2026-06-27.docx
+++ b/shared/documentation/project_library/MapSnap/MapSnap_Video_Script_2026-06-27.docx
@@ -2,107 +2,255 @@
 <file path=word/document.xml><?xml version="1.0" encoding="utf-8"?>
 <w:document xmlns:wpc="http://schemas.microsoft.com/office/word/2010/wordprocessingCanvas" xmlns:mo="http://schemas.microsoft.com/office/mac/office/2008/main" xmlns:mc="http://schemas.openxmlformats.org/markup-compatibility/2006" xmlns:mv="urn:schemas-microsoft-com:mac:vml" xmlns:o="urn:schemas-microsoft-com:office:office" xmlns:r="http://schemas.openxmlformats.org/officeDocument/2006/relationships" xmlns:m="http://schemas.openxmlformats.org/officeDocument/2006/math" xmlns:v="urn:schemas-microsoft-com:vml" xmlns:wp14="http://schemas.microsoft.com/office/word/2010/wordprocessingDrawing" xmlns:wp="http://schemas.openxmlformats.org/drawingml/2006/wordprocessingDrawing" xmlns:w10="urn:schemas-microsoft-com:office:word" xmlns:w="http://schemas.openxmlformats.org/wordprocessingml/2006/main" xmlns:w14="http://schemas.microsoft.com/office/word/2010/wordml" xmlns:wpg="http://schemas.microsoft.com/office/word/2010/wordprocessingGroup" xmlns:wpi="http://schemas.microsoft.com/office/word/2010/wordprocessingInk" xmlns:wne="http://schemas.microsoft.com/office/word/2006/wordml" xmlns:wps="http://schemas.microsoft.com/office/word/2010/wordprocessingShape" mc:Ignorable="w14 wp14">
   <w:body>
+    <w:p>
+      <w:pPr>
+        <w:spacing w:after="0"/>
+        <w:pBdr>
+          <w:bottom w:val="single" w:sz="48" w:space="0" w:color="0D6EA6"/>
+        </w:pBdr>
+      </w:pPr>
+    </w:p>
+    <w:p>
+      <w:pPr>
+        <w:spacing w:before="160"/>
+      </w:pPr>
+      <w:r>
+        <w:rPr>
+          <w:rFonts w:ascii="Segoe UI" w:hAnsi="Segoe UI"/>
+          <w:b/>
+          <w:color w:val="64748B"/>
+          <w:sz w:val="20"/>
+        </w:rPr>
+        <w:t>Q U I D D I T Y   I N N O V A T I O N S</w:t>
+      </w:r>
+    </w:p>
+    <w:p>
+      <w:r>
+        <w:rPr>
+          <w:rFonts w:ascii="Segoe UI" w:hAnsi="Segoe UI"/>
+          <w:color w:val="0D6EA6"/>
+          <w:sz w:val="20"/>
+        </w:rPr>
+        <w:t>QI Hive · Project Documentation Library</w:t>
+      </w:r>
+    </w:p>
+    <w:p/>
+    <w:p/>
     <w:p/>
     <w:p/>
     <w:p/>
     <w:p>
-      <w:pPr>
-        <w:spacing w:after="40"/>
-        <w:jc w:val="center"/>
-      </w:pPr>
       <w:r>
         <w:rPr>
+          <w:rFonts w:ascii="Segoe UI" w:hAnsi="Segoe UI"/>
           <w:b/>
-          <w:i w:val="0"/>
-          <w:color w:val="B31B1B"/>
-          <w:sz w:val="30"/>
-        </w:rPr>
-        <w:t>QUIDDITY INNOVATIONS</w:t>
-      </w:r>
-    </w:p>
-    <w:p>
-      <w:pPr>
-        <w:spacing w:after="80"/>
-        <w:jc w:val="center"/>
-      </w:pPr>
-      <w:r>
-        <w:rPr>
-          <w:b/>
-          <w:i w:val="0"/>
-          <w:color w:val="222222"/>
-          <w:sz w:val="52"/>
+          <w:color w:val="1F2937"/>
+          <w:sz w:val="64"/>
         </w:rPr>
         <w:t>MapSnap — Explainer Video Script</w:t>
       </w:r>
     </w:p>
     <w:p>
       <w:pPr>
-        <w:spacing w:after="360"/>
-        <w:jc w:val="center"/>
+        <w:pBdr>
+          <w:bottom w:val="single" w:sz="10" w:space="10" w:color="C9D4DE"/>
+        </w:pBdr>
       </w:pPr>
       <w:r>
         <w:rPr>
-          <w:b w:val="0"/>
-          <w:i/>
-          <w:color w:val="666666"/>
-          <w:sz w:val="26"/>
+          <w:rFonts w:ascii="Segoe UI" w:hAnsi="Segoe UI"/>
+          <w:color w:val="0D6EA6"/>
+          <w:sz w:val="32"/>
         </w:rPr>
-        <w:t>Understand any enterprise database, in plain English</w:t>
+        <w:t>Video Production Document</w:t>
       </w:r>
     </w:p>
-    <w:p>
-      <w:pPr>
-        <w:spacing w:after="40"/>
-        <w:jc w:val="center"/>
-      </w:pPr>
-      <w:r>
-        <w:rPr>
-          <w:b/>
-          <w:i w:val="0"/>
-          <w:color w:val="222222"/>
-          <w:sz w:val="24"/>
-        </w:rPr>
-        <w:t>Two-narrator script · Andrew (male) &amp; Ava (Microsoft neural voices)</w:t>
-      </w:r>
-    </w:p>
-    <w:p>
-      <w:pPr>
-        <w:spacing w:after="40"/>
-        <w:jc w:val="center"/>
-      </w:pPr>
-      <w:r>
-        <w:rPr>
-          <w:b w:val="0"/>
-          <w:i/>
-          <w:color w:val="666666"/>
-          <w:sz w:val="22"/>
-        </w:rPr>
-        <w:t>Each scene ties a technology to the feature it powers</w:t>
-      </w:r>
-    </w:p>
-    <w:p>
-      <w:pPr>
-        <w:spacing w:after="80"/>
-        <w:jc w:val="center"/>
-      </w:pPr>
-      <w:r>
-        <w:rPr>
-          <w:b w:val="0"/>
-          <w:i/>
-          <w:color w:val="666666"/>
-          <w:sz w:val="20"/>
-        </w:rPr>
-        <w:t>Generated 2026-06-27</w:t>
-      </w:r>
-    </w:p>
+    <w:p/>
+    <w:p/>
+    <w:p/>
+    <w:tbl>
+      <w:tblPr>
+        <w:tblW w:type="auto" w:w="0"/>
+        <w:tblLook w:firstColumn="1" w:firstRow="1" w:lastColumn="0" w:lastRow="0" w:noHBand="0" w:noVBand="1" w:val="04A0"/>
+        <w:tblBorders>
+          <w:top w:val="none" w:sz="0" w:color="auto"/>
+          <w:left w:val="none" w:sz="0" w:color="auto"/>
+          <w:bottom w:val="none" w:sz="0" w:color="auto"/>
+          <w:right w:val="none" w:sz="0" w:color="auto"/>
+          <w:insideH w:val="single" w:sz="4" w:color="C9D4DE"/>
+          <w:insideV w:val="none" w:sz="0" w:color="auto"/>
+        </w:tblBorders>
+        <w:tblCellMar>
+          <w:top w:w="60" w:type="dxa"/>
+          <w:left w:w="0" w:type="dxa"/>
+          <w:bottom w:w="60" w:type="dxa"/>
+          <w:right w:w="90" w:type="dxa"/>
+        </w:tblCellMar>
+      </w:tblPr>
+      <w:tblGrid>
+        <w:gridCol w:w="2160"/>
+        <w:gridCol w:w="7344"/>
+      </w:tblGrid>
+      <w:tr>
+        <w:tc>
+          <w:tcPr>
+            <w:tcW w:type="dxa" w:w="2160"/>
+          </w:tcPr>
+          <w:p>
+            <w:r>
+              <w:rPr>
+                <w:rFonts w:ascii="Segoe UI" w:hAnsi="Segoe UI"/>
+                <w:b/>
+                <w:color w:val="64748B"/>
+                <w:sz w:val="16"/>
+              </w:rPr>
+              <w:t>GENERATED</w:t>
+            </w:r>
+          </w:p>
+        </w:tc>
+        <w:tc>
+          <w:tcPr>
+            <w:tcW w:type="dxa" w:w="7344"/>
+          </w:tcPr>
+          <w:p>
+            <w:r>
+              <w:rPr>
+                <w:sz w:val="19"/>
+              </w:rPr>
+              <w:t>2026-08-06</w:t>
+            </w:r>
+          </w:p>
+        </w:tc>
+      </w:tr>
+      <w:tr>
+        <w:tc>
+          <w:tcPr>
+            <w:tcW w:type="dxa" w:w="2160"/>
+          </w:tcPr>
+          <w:p>
+            <w:r>
+              <w:rPr>
+                <w:rFonts w:ascii="Segoe UI" w:hAnsi="Segoe UI"/>
+                <w:b/>
+                <w:color w:val="64748B"/>
+                <w:sz w:val="16"/>
+              </w:rPr>
+              <w:t>SOURCE</w:t>
+            </w:r>
+          </w:p>
+        </w:tc>
+        <w:tc>
+          <w:tcPr>
+            <w:tcW w:type="dxa" w:w="7344"/>
+          </w:tcPr>
+          <w:p>
+            <w:r>
+              <w:rPr>
+                <w:rFonts w:ascii="Consolas" w:hAnsi="Consolas"/>
+                <w:sz w:val="17"/>
+              </w:rPr>
+              <w:t>shared\documentation\project_library\MapSnap\MapSnap_Video_Script_2026-06-27.docx</w:t>
+            </w:r>
+          </w:p>
+        </w:tc>
+      </w:tr>
+      <w:tr>
+        <w:tc>
+          <w:tcPr>
+            <w:tcW w:type="dxa" w:w="2160"/>
+          </w:tcPr>
+          <w:p>
+            <w:r>
+              <w:rPr>
+                <w:rFonts w:ascii="Segoe UI" w:hAnsi="Segoe UI"/>
+                <w:b/>
+                <w:color w:val="64748B"/>
+                <w:sz w:val="16"/>
+              </w:rPr>
+              <w:t>CLASSIFICATION</w:t>
+            </w:r>
+          </w:p>
+        </w:tc>
+        <w:tc>
+          <w:tcPr>
+            <w:tcW w:type="dxa" w:w="7344"/>
+          </w:tcPr>
+          <w:p>
+            <w:r>
+              <w:rPr>
+                <w:sz w:val="19"/>
+              </w:rPr>
+              <w:t>Internal — QI Ecosystem</w:t>
+            </w:r>
+          </w:p>
+        </w:tc>
+      </w:tr>
+    </w:tbl>
     <w:p>
       <w:r>
         <w:br w:type="page"/>
       </w:r>
     </w:p>
     <w:p>
+      <w:r>
+        <w:rPr>
+          <w:b/>
+          <w:i w:val="0"/>
+        </w:rPr>
+        <w:t>QUIDDITY INNOVATIONS</w:t>
+      </w:r>
+    </w:p>
+    <w:p>
+      <w:r>
+        <w:rPr>
+          <w:b/>
+          <w:i w:val="0"/>
+        </w:rPr>
+        <w:t>MapSnap — Explainer Video Script</w:t>
+      </w:r>
+    </w:p>
+    <w:p>
+      <w:r>
+        <w:rPr>
+          <w:b w:val="0"/>
+          <w:i/>
+        </w:rPr>
+        <w:t>Understand any enterprise database, in plain English</w:t>
+      </w:r>
+    </w:p>
+    <w:p>
+      <w:r>
+        <w:rPr>
+          <w:b/>
+          <w:i w:val="0"/>
+        </w:rPr>
+        <w:t>Two-narrator script · Andrew (male) &amp; Ava (Microsoft neural voices)</w:t>
+      </w:r>
+    </w:p>
+    <w:p>
+      <w:r>
+        <w:rPr>
+          <w:b w:val="0"/>
+          <w:i/>
+        </w:rPr>
+        <w:t>Each scene ties a technology to the feature it powers</w:t>
+      </w:r>
+    </w:p>
+    <w:p>
+      <w:r>
+        <w:rPr>
+          <w:b w:val="0"/>
+          <w:i/>
+        </w:rPr>
+        <w:t>Generated 2026-06-27</w:t>
+      </w:r>
+    </w:p>
+    <w:p>
       <w:pPr>
         <w:pStyle w:val="Heading1"/>
+        <w:pBdr>
+          <w:bottom w:val="single" w:sz="14" w:space="6" w:color="0D6EA6"/>
+        </w:pBdr>
       </w:pPr>
       <w:r>
         <w:t>Production notes</w:t>
@@ -113,6 +261,7 @@
         <w:pStyle w:val="ListBullet"/>
       </w:pPr>
       <w:r>
+        <w:rPr/>
         <w:t>Voices: Andrew = en-US-AndrewNeural (male); Ava = en-US-AvaNeural (female), via edge-tts.</w:t>
       </w:r>
     </w:p>
@@ -121,6 +270,7 @@
         <w:pStyle w:val="ListBullet"/>
       </w:pPr>
       <w:r>
+        <w:rPr/>
         <w:t>Format: alternating narration over branded slides; one slide per scene.</w:t>
       </w:r>
     </w:p>
@@ -129,6 +279,7 @@
         <w:pStyle w:val="ListBullet"/>
       </w:pPr>
       <w:r>
+        <w:rPr/>
         <w:t>Scenes: 8. Estimated runtime: ~3–4 minutes.</w:t>
       </w:r>
     </w:p>
@@ -137,6 +288,7 @@
         <w:pStyle w:val="ListBullet"/>
       </w:pPr>
       <w:r>
+        <w:rPr/>
         <w:t>Each scene names the TECHNOLOGY and the FEATURE it powers, shown as on-screen chips.</w:t>
       </w:r>
     </w:p>
@@ -145,32 +297,26 @@
         <w:pStyle w:val="ListBullet"/>
       </w:pPr>
       <w:r>
+        <w:rPr/>
         <w:t>Source: QI Hive Project-Status library (status_intro / status_features_dev / status_techstack).</w:t>
-      </w:r>
-    </w:p>
-    <w:p>
-      <w:r>
-        <w:br w:type="page"/>
       </w:r>
     </w:p>
     <w:p>
       <w:pPr>
         <w:pStyle w:val="Heading1"/>
+        <w:pBdr>
+          <w:bottom w:val="single" w:sz="14" w:space="6" w:color="0D6EA6"/>
+        </w:pBdr>
       </w:pPr>
       <w:r>
         <w:t>Scene 1 — MapSnap</w:t>
       </w:r>
     </w:p>
     <w:p>
-      <w:pPr>
-        <w:spacing w:after="80"/>
-      </w:pPr>
       <w:r>
         <w:rPr>
           <w:b w:val="0"/>
           <w:i/>
-          <w:color w:val="666666"/>
-          <w:sz w:val="23"/>
         </w:rPr>
         <w:t>Understand any enterprise database — in plain English</w:t>
       </w:r>
@@ -179,8 +325,6 @@
       <w:r>
         <w:rPr>
           <w:b/>
-          <w:color w:val="B31B1B"/>
-          <w:sz w:val="19"/>
         </w:rPr>
         <w:t>ON SCREEN:</w:t>
       </w:r>
@@ -190,9 +334,7 @@
         <w:pStyle w:val="ListBullet"/>
       </w:pPr>
       <w:r>
-        <w:rPr>
-          <w:sz w:val="21"/>
-        </w:rPr>
+        <w:rPr/>
         <w:t>A local-first schema-intelligence tool by Quiddity Innovations</w:t>
       </w:r>
     </w:p>
@@ -200,76 +342,62 @@
       <w:r>
         <w:rPr>
           <w:b/>
-          <w:color w:val="B31B1B"/>
-          <w:sz w:val="19"/>
         </w:rPr>
         <w:t>NARRATION:</w:t>
       </w:r>
     </w:p>
     <w:p>
-      <w:pPr>
-        <w:spacing w:after="120"/>
-      </w:pPr>
       <w:r>
         <w:rPr>
           <w:b/>
-          <w:color w:val="B31B1B"/>
         </w:rPr>
         <w:t xml:space="preserve">Ava:  </w:t>
       </w:r>
       <w:r>
+        <w:rPr/>
         <w:t>Meet MapSnap — Quiddity Innovations' schema-intelligence tool.</w:t>
       </w:r>
     </w:p>
     <w:p>
-      <w:pPr>
-        <w:spacing w:after="120"/>
-      </w:pPr>
       <w:r>
         <w:rPr>
           <w:b/>
-          <w:color w:val="B31B1B"/>
         </w:rPr>
         <w:t xml:space="preserve">Andrew:  </w:t>
       </w:r>
       <w:r>
+        <w:rPr/>
         <w:t>Point it at a giant, undocumented enterprise database, and it gives you a full map of every table, column, key and relationship — plus an A-I assistant that explains it and writes the S-Q-L for you.</w:t>
       </w:r>
     </w:p>
     <w:p>
-      <w:pPr>
-        <w:spacing w:after="120"/>
-      </w:pPr>
       <w:r>
         <w:rPr>
           <w:b/>
-          <w:color w:val="B31B1B"/>
         </w:rPr>
         <w:t xml:space="preserve">Ava:  </w:t>
       </w:r>
       <w:r>
+        <w:rPr/>
         <w:t>Let's look at how it works — and the technology behind each piece.</w:t>
       </w:r>
     </w:p>
-    <w:p/>
     <w:p>
       <w:pPr>
         <w:pStyle w:val="Heading1"/>
+        <w:pBdr>
+          <w:bottom w:val="single" w:sz="14" w:space="6" w:color="0D6EA6"/>
+        </w:pBdr>
       </w:pPr>
       <w:r>
         <w:t>Scene 2 — The problem</w:t>
       </w:r>
     </w:p>
     <w:p>
-      <w:pPr>
-        <w:spacing w:after="80"/>
-      </w:pPr>
       <w:r>
         <w:rPr>
           <w:b w:val="0"/>
           <w:i/>
-          <w:color w:val="666666"/>
-          <w:sz w:val="23"/>
         </w:rPr>
         <w:t>Enterprise schemas are cryptic, undocumented, and risky to query</w:t>
       </w:r>
@@ -278,8 +406,6 @@
       <w:r>
         <w:rPr>
           <w:b/>
-          <w:color w:val="B31B1B"/>
-          <w:sz w:val="19"/>
         </w:rPr>
         <w:t>ON SCREEN:</w:t>
       </w:r>
@@ -289,9 +415,7 @@
         <w:pStyle w:val="ListBullet"/>
       </w:pPr>
       <w:r>
-        <w:rPr>
-          <w:sz w:val="21"/>
-        </w:rPr>
+        <w:rPr/>
         <w:t>An OnBase database has 2,300+ tables with names like hsi.itemdata</w:t>
       </w:r>
     </w:p>
@@ -300,9 +424,7 @@
         <w:pStyle w:val="ListBullet"/>
       </w:pPr>
       <w:r>
-        <w:rPr>
-          <w:sz w:val="21"/>
-        </w:rPr>
+        <w:rPr/>
         <w:t>Foreign keys often aren't declared — the map looks like islands</w:t>
       </w:r>
     </w:p>
@@ -311,9 +433,7 @@
         <w:pStyle w:val="ListBullet"/>
       </w:pPr>
       <w:r>
-        <w:rPr>
-          <w:sz w:val="21"/>
-        </w:rPr>
+        <w:rPr/>
         <w:t>Regulated data can't be casually shipped to a cloud A-I</w:t>
       </w:r>
     </w:p>
@@ -321,76 +441,62 @@
       <w:r>
         <w:rPr>
           <w:b/>
-          <w:color w:val="B31B1B"/>
-          <w:sz w:val="19"/>
         </w:rPr>
         <w:t>NARRATION:</w:t>
       </w:r>
     </w:p>
     <w:p>
-      <w:pPr>
-        <w:spacing w:after="120"/>
-      </w:pPr>
       <w:r>
         <w:rPr>
           <w:b/>
-          <w:color w:val="B31B1B"/>
         </w:rPr>
         <w:t xml:space="preserve">Andrew:  </w:t>
       </w:r>
       <w:r>
+        <w:rPr/>
         <w:t>Here's the problem. A Hyland OnBase database can hold over two thousand three hundred tables, with names like h-s-i dot itemdata. Nobody on staff knows where the checks or the student transcripts actually live.</w:t>
       </w:r>
     </w:p>
     <w:p>
-      <w:pPr>
-        <w:spacing w:after="120"/>
-      </w:pPr>
       <w:r>
         <w:rPr>
           <w:b/>
-          <w:color w:val="B31B1B"/>
         </w:rPr>
         <w:t xml:space="preserve">Ava:  </w:t>
       </w:r>
       <w:r>
+        <w:rPr/>
         <w:t>And because OnBase enforces relationships in the application layer, a raw schema dump shows almost no joins. The map looks like disconnected islands.</w:t>
       </w:r>
     </w:p>
     <w:p>
-      <w:pPr>
-        <w:spacing w:after="120"/>
-      </w:pPr>
       <w:r>
         <w:rPr>
           <w:b/>
-          <w:color w:val="B31B1B"/>
         </w:rPr>
         <w:t xml:space="preserve">Andrew:  </w:t>
       </w:r>
       <w:r>
+        <w:rPr/>
         <w:t>Worst of all — regulated data, under FERPA, GLBA or HIPAA, simply cannot be shipped off to a cloud chatbot.</w:t>
       </w:r>
     </w:p>
-    <w:p/>
     <w:p>
       <w:pPr>
         <w:pStyle w:val="Heading1"/>
+        <w:pBdr>
+          <w:bottom w:val="single" w:sz="14" w:space="6" w:color="0D6EA6"/>
+        </w:pBdr>
       </w:pPr>
       <w:r>
         <w:t>Scene 3 — One portable Python service</w:t>
       </w:r>
     </w:p>
     <w:p>
-      <w:pPr>
-        <w:spacing w:after="80"/>
-      </w:pPr>
       <w:r>
         <w:rPr>
           <w:b w:val="0"/>
           <w:i/>
-          <w:color w:val="666666"/>
-          <w:sz w:val="23"/>
         </w:rPr>
         <w:t>Zero-framework server — trivially portable, even air-gapped</w:t>
       </w:r>
@@ -398,56 +504,68 @@
     <w:tbl>
       <w:tblPr>
         <w:tblW w:type="auto" w:w="0"/>
+        <w:jc w:val="left"/>
         <w:tblLook w:firstColumn="1" w:firstRow="1" w:lastColumn="0" w:lastRow="0" w:noHBand="0" w:noVBand="1" w:val="04A0"/>
+        <w:tblBorders>
+          <w:top w:val="single" w:sz="8" w:color="0D6EA6"/>
+          <w:left w:val="none" w:sz="0" w:color="auto"/>
+          <w:bottom w:val="single" w:sz="8" w:color="C9D4DE"/>
+          <w:right w:val="none" w:sz="0" w:color="auto"/>
+          <w:insideH w:val="single" w:sz="4" w:color="C9D4DE"/>
+          <w:insideV w:val="none" w:sz="0" w:color="auto"/>
+        </w:tblBorders>
+        <w:tblCellMar>
+          <w:top w:w="40" w:type="dxa"/>
+          <w:left w:w="90" w:type="dxa"/>
+          <w:bottom w:w="40" w:type="dxa"/>
+          <w:right w:w="90" w:type="dxa"/>
+        </w:tblCellMar>
       </w:tblPr>
       <w:tblGrid>
-        <w:gridCol w:w="4320"/>
-        <w:gridCol w:w="4320"/>
+        <w:gridCol w:w="4752"/>
+        <w:gridCol w:w="4752"/>
       </w:tblGrid>
       <w:tr>
+        <w:trPr>
+          <w:tblHeader w:val="true"/>
+        </w:trPr>
         <w:tc>
           <w:tcPr>
-            <w:tcW w:type="dxa" w:w="4320"/>
-            <w:shd w:val="clear" w:color="auto" w:fill="B31B1B"/>
+            <w:tcW w:type="dxa" w:w="4752"/>
+            <w:shd w:val="clear" w:fill="0D6EA6"/>
           </w:tcPr>
           <w:p>
+            <w:pPr>
+              <w:spacing w:after="0" w:before="0"/>
+            </w:pPr>
             <w:r>
               <w:rPr>
+                <w:rFonts w:ascii="Segoe UI" w:hAnsi="Segoe UI"/>
                 <w:b/>
                 <w:color w:val="FFFFFF"/>
-                <w:sz w:val="19"/>
+                <w:sz w:val="18"/>
               </w:rPr>
-              <w:t xml:space="preserve">Technology: </w:t>
-            </w:r>
-            <w:r>
-              <w:rPr>
-                <w:color w:val="FFFFFF"/>
-                <w:sz w:val="19"/>
-              </w:rPr>
-              <w:t>Python · stdlib http.server</w:t>
+              <w:t>Technology: Python · stdlib http.server</w:t>
             </w:r>
           </w:p>
         </w:tc>
         <w:tc>
           <w:tcPr>
-            <w:tcW w:type="dxa" w:w="4320"/>
-            <w:shd w:val="clear" w:color="auto" w:fill="B31B1B"/>
+            <w:tcW w:type="dxa" w:w="4752"/>
+            <w:shd w:val="clear" w:fill="0D6EA6"/>
           </w:tcPr>
           <w:p>
+            <w:pPr>
+              <w:spacing w:after="0" w:before="0"/>
+            </w:pPr>
             <w:r>
               <w:rPr>
+                <w:rFonts w:ascii="Segoe UI" w:hAnsi="Segoe UI"/>
                 <w:b/>
                 <w:color w:val="FFFFFF"/>
-                <w:sz w:val="19"/>
+                <w:sz w:val="18"/>
               </w:rPr>
-              <w:t xml:space="preserve">Feature: </w:t>
-            </w:r>
-            <w:r>
-              <w:rPr>
-                <w:color w:val="FFFFFF"/>
-                <w:sz w:val="19"/>
-              </w:rPr>
-              <w:t>The whole app</w:t>
+              <w:t>Feature: The whole app</w:t>
             </w:r>
           </w:p>
         </w:tc>
@@ -462,8 +580,6 @@
       <w:r>
         <w:rPr>
           <w:b/>
-          <w:color w:val="B31B1B"/>
-          <w:sz w:val="19"/>
         </w:rPr>
         <w:t>ON SCREEN:</w:t>
       </w:r>
@@ -473,9 +589,7 @@
         <w:pStyle w:val="ListBullet"/>
       </w:pPr>
       <w:r>
-        <w:rPr>
-          <w:sz w:val="21"/>
-        </w:rPr>
+        <w:rPr/>
         <w:t>A single Python process, standard-library HTTP server on localhost:9876</w:t>
       </w:r>
     </w:p>
@@ -484,9 +598,7 @@
         <w:pStyle w:val="ListBullet"/>
       </w:pPr>
       <w:r>
-        <w:rPr>
-          <w:sz w:val="21"/>
-        </w:rPr>
+        <w:rPr/>
         <w:t>Serves one rich single-page HTML browser — no Flask, no FastAPI</w:t>
       </w:r>
     </w:p>
@@ -494,61 +606,50 @@
       <w:r>
         <w:rPr>
           <w:b/>
-          <w:color w:val="B31B1B"/>
-          <w:sz w:val="19"/>
         </w:rPr>
         <w:t>NARRATION:</w:t>
       </w:r>
     </w:p>
     <w:p>
-      <w:pPr>
-        <w:spacing w:after="120"/>
-      </w:pPr>
       <w:r>
         <w:rPr>
           <w:b/>
-          <w:color w:val="B31B1B"/>
         </w:rPr>
         <w:t xml:space="preserve">Ava:  </w:t>
       </w:r>
       <w:r>
+        <w:rPr/>
         <w:t>MapSnap is deliberately simple. The whole thing is one Python process running the standard-library H-T-T-P server on localhost, port nine-eight-seven-six.</w:t>
       </w:r>
     </w:p>
     <w:p>
-      <w:pPr>
-        <w:spacing w:after="120"/>
-      </w:pPr>
       <w:r>
         <w:rPr>
           <w:b/>
-          <w:color w:val="B31B1B"/>
         </w:rPr>
         <w:t xml:space="preserve">Andrew:  </w:t>
       </w:r>
       <w:r>
+        <w:rPr/>
         <w:t>No web framework. No database server to install. That zero-dependency design is exactly what lets MapSnap drop onto a customer box — or an air-gapped machine — and just run.</w:t>
       </w:r>
     </w:p>
-    <w:p/>
     <w:p>
       <w:pPr>
         <w:pStyle w:val="Heading1"/>
+        <w:pBdr>
+          <w:bottom w:val="single" w:sz="14" w:space="6" w:color="0D6EA6"/>
+        </w:pBdr>
       </w:pPr>
       <w:r>
         <w:t>Scene 4 — Map any engine</w:t>
       </w:r>
     </w:p>
     <w:p>
-      <w:pPr>
-        <w:spacing w:after="80"/>
-      </w:pPr>
       <w:r>
         <w:rPr>
           <w:b w:val="0"/>
           <w:i/>
-          <w:color w:val="666666"/>
-          <w:sz w:val="23"/>
         </w:rPr>
         <w:t>One canonical schema from any database</w:t>
       </w:r>
@@ -556,56 +657,68 @@
     <w:tbl>
       <w:tblPr>
         <w:tblW w:type="auto" w:w="0"/>
+        <w:jc w:val="left"/>
         <w:tblLook w:firstColumn="1" w:firstRow="1" w:lastColumn="0" w:lastRow="0" w:noHBand="0" w:noVBand="1" w:val="04A0"/>
+        <w:tblBorders>
+          <w:top w:val="single" w:sz="8" w:color="0D6EA6"/>
+          <w:left w:val="none" w:sz="0" w:color="auto"/>
+          <w:bottom w:val="single" w:sz="8" w:color="C9D4DE"/>
+          <w:right w:val="none" w:sz="0" w:color="auto"/>
+          <w:insideH w:val="single" w:sz="4" w:color="C9D4DE"/>
+          <w:insideV w:val="none" w:sz="0" w:color="auto"/>
+        </w:tblBorders>
+        <w:tblCellMar>
+          <w:top w:w="40" w:type="dxa"/>
+          <w:left w:w="90" w:type="dxa"/>
+          <w:bottom w:w="40" w:type="dxa"/>
+          <w:right w:w="90" w:type="dxa"/>
+        </w:tblCellMar>
       </w:tblPr>
       <w:tblGrid>
-        <w:gridCol w:w="4320"/>
-        <w:gridCol w:w="4320"/>
+        <w:gridCol w:w="4752"/>
+        <w:gridCol w:w="4752"/>
       </w:tblGrid>
       <w:tr>
+        <w:trPr>
+          <w:tblHeader w:val="true"/>
+        </w:trPr>
         <w:tc>
           <w:tcPr>
-            <w:tcW w:type="dxa" w:w="4320"/>
-            <w:shd w:val="clear" w:color="auto" w:fill="B31B1B"/>
+            <w:tcW w:type="dxa" w:w="4752"/>
+            <w:shd w:val="clear" w:fill="0D6EA6"/>
           </w:tcPr>
           <w:p>
+            <w:pPr>
+              <w:spacing w:after="0" w:before="0"/>
+            </w:pPr>
             <w:r>
               <w:rPr>
+                <w:rFonts w:ascii="Segoe UI" w:hAnsi="Segoe UI"/>
                 <w:b/>
                 <w:color w:val="FFFFFF"/>
-                <w:sz w:val="19"/>
+                <w:sz w:val="18"/>
               </w:rPr>
-              <w:t xml:space="preserve">Technology: </w:t>
-            </w:r>
-            <w:r>
-              <w:rPr>
-                <w:color w:val="FFFFFF"/>
-                <w:sz w:val="19"/>
-              </w:rPr>
-              <w:t>pyodbc · psycopg2 · PyMySQL · oracledb</w:t>
+              <w:t>Technology: pyodbc · psycopg2 · PyMySQL · oracledb</w:t>
             </w:r>
           </w:p>
         </w:tc>
         <w:tc>
           <w:tcPr>
-            <w:tcW w:type="dxa" w:w="4320"/>
-            <w:shd w:val="clear" w:color="auto" w:fill="B31B1B"/>
+            <w:tcW w:type="dxa" w:w="4752"/>
+            <w:shd w:val="clear" w:fill="0D6EA6"/>
           </w:tcPr>
           <w:p>
+            <w:pPr>
+              <w:spacing w:after="0" w:before="0"/>
+            </w:pPr>
             <w:r>
               <w:rPr>
+                <w:rFonts w:ascii="Segoe UI" w:hAnsi="Segoe UI"/>
                 <w:b/>
                 <w:color w:val="FFFFFF"/>
-                <w:sz w:val="19"/>
+                <w:sz w:val="18"/>
               </w:rPr>
-              <w:t xml:space="preserve">Feature: </w:t>
-            </w:r>
-            <w:r>
-              <w:rPr>
-                <w:color w:val="FFFFFF"/>
-                <w:sz w:val="19"/>
-              </w:rPr>
-              <w:t>Multi-engine extract</w:t>
+              <w:t>Feature: Multi-engine extract</w:t>
             </w:r>
           </w:p>
         </w:tc>
@@ -620,8 +733,6 @@
       <w:r>
         <w:rPr>
           <w:b/>
-          <w:color w:val="B31B1B"/>
-          <w:sz w:val="19"/>
         </w:rPr>
         <w:t>ON SCREEN:</w:t>
       </w:r>
@@ -631,9 +742,7 @@
         <w:pStyle w:val="ListBullet"/>
       </w:pPr>
       <w:r>
-        <w:rPr>
-          <w:sz w:val="21"/>
-        </w:rPr>
+        <w:rPr/>
         <w:t>Interchangeable extractors: SQL Server, PostgreSQL, MySQL, Oracle, SQLite</w:t>
       </w:r>
     </w:p>
@@ -642,9 +751,7 @@
         <w:pStyle w:val="ListBullet"/>
       </w:pPr>
       <w:r>
-        <w:rPr>
-          <w:sz w:val="21"/>
-        </w:rPr>
+        <w:rPr/>
         <w:t>Drivers installed on demand through a strict pip allow-list</w:t>
       </w:r>
     </w:p>
@@ -653,9 +760,7 @@
         <w:pStyle w:val="ListBullet"/>
       </w:pPr>
       <w:r>
-        <w:rPr>
-          <w:sz w:val="21"/>
-        </w:rPr>
+        <w:rPr/>
         <w:t>Soft-FK inference rebuilds the joins OnBase never declared</w:t>
       </w:r>
     </w:p>
@@ -663,76 +768,62 @@
       <w:r>
         <w:rPr>
           <w:b/>
-          <w:color w:val="B31B1B"/>
-          <w:sz w:val="19"/>
         </w:rPr>
         <w:t>NARRATION:</w:t>
       </w:r>
     </w:p>
     <w:p>
-      <w:pPr>
-        <w:spacing w:after="120"/>
-      </w:pPr>
       <w:r>
         <w:rPr>
           <w:b/>
-          <w:color w:val="B31B1B"/>
         </w:rPr>
         <w:t xml:space="preserve">Andrew:  </w:t>
       </w:r>
       <w:r>
+        <w:rPr/>
         <w:t>To read your database, MapSnap uses a family of interchangeable drivers — pyodbc for SQL Server, psycopg-two for Postgres, PyMySQL for MySQL, and oracledb for Oracle.</w:t>
       </w:r>
     </w:p>
     <w:p>
-      <w:pPr>
-        <w:spacing w:after="120"/>
-      </w:pPr>
       <w:r>
         <w:rPr>
           <w:b/>
-          <w:color w:val="B31B1B"/>
         </w:rPr>
         <w:t xml:space="preserve">Ava:  </w:t>
       </w:r>
       <w:r>
+        <w:rPr/>
         <w:t>They're installed on demand through a strict allow-list, so the app ships thin and only pulls the one driver your connection needs.</w:t>
       </w:r>
     </w:p>
     <w:p>
-      <w:pPr>
-        <w:spacing w:after="120"/>
-      </w:pPr>
       <w:r>
         <w:rPr>
           <w:b/>
-          <w:color w:val="B31B1B"/>
         </w:rPr>
         <w:t xml:space="preserve">Andrew:  </w:t>
       </w:r>
       <w:r>
+        <w:rPr/>
         <w:t>And for schemas like OnBase that don't declare their foreign keys, a soft-key inference step rebuilds the relationships from naming conventions — so your islands turn back into a connected map.</w:t>
       </w:r>
     </w:p>
-    <w:p/>
     <w:p>
       <w:pPr>
         <w:pStyle w:val="Heading1"/>
+        <w:pBdr>
+          <w:bottom w:val="single" w:sz="14" w:space="6" w:color="0D6EA6"/>
+        </w:pBdr>
       </w:pPr>
       <w:r>
         <w:t>Scene 5 — Ask in plain English</w:t>
       </w:r>
     </w:p>
     <w:p>
-      <w:pPr>
-        <w:spacing w:after="80"/>
-      </w:pPr>
       <w:r>
         <w:rPr>
           <w:b w:val="0"/>
           <w:i/>
-          <w:color w:val="666666"/>
-          <w:sz w:val="23"/>
         </w:rPr>
         <w:t>Local A-I that understands meaning, not just names</w:t>
       </w:r>
@@ -740,56 +831,68 @@
     <w:tbl>
       <w:tblPr>
         <w:tblW w:type="auto" w:w="0"/>
+        <w:jc w:val="left"/>
         <w:tblLook w:firstColumn="1" w:firstRow="1" w:lastColumn="0" w:lastRow="0" w:noHBand="0" w:noVBand="1" w:val="04A0"/>
+        <w:tblBorders>
+          <w:top w:val="single" w:sz="8" w:color="0D6EA6"/>
+          <w:left w:val="none" w:sz="0" w:color="auto"/>
+          <w:bottom w:val="single" w:sz="8" w:color="C9D4DE"/>
+          <w:right w:val="none" w:sz="0" w:color="auto"/>
+          <w:insideH w:val="single" w:sz="4" w:color="C9D4DE"/>
+          <w:insideV w:val="none" w:sz="0" w:color="auto"/>
+        </w:tblBorders>
+        <w:tblCellMar>
+          <w:top w:w="40" w:type="dxa"/>
+          <w:left w:w="90" w:type="dxa"/>
+          <w:bottom w:w="40" w:type="dxa"/>
+          <w:right w:w="90" w:type="dxa"/>
+        </w:tblCellMar>
       </w:tblPr>
       <w:tblGrid>
-        <w:gridCol w:w="4320"/>
-        <w:gridCol w:w="4320"/>
+        <w:gridCol w:w="4752"/>
+        <w:gridCol w:w="4752"/>
       </w:tblGrid>
       <w:tr>
+        <w:trPr>
+          <w:tblHeader w:val="true"/>
+        </w:trPr>
         <w:tc>
           <w:tcPr>
-            <w:tcW w:type="dxa" w:w="4320"/>
-            <w:shd w:val="clear" w:color="auto" w:fill="B31B1B"/>
+            <w:tcW w:type="dxa" w:w="4752"/>
+            <w:shd w:val="clear" w:fill="0D6EA6"/>
           </w:tcPr>
           <w:p>
+            <w:pPr>
+              <w:spacing w:after="0" w:before="0"/>
+            </w:pPr>
             <w:r>
               <w:rPr>
+                <w:rFonts w:ascii="Segoe UI" w:hAnsi="Segoe UI"/>
                 <w:b/>
                 <w:color w:val="FFFFFF"/>
-                <w:sz w:val="19"/>
+                <w:sz w:val="18"/>
               </w:rPr>
-              <w:t xml:space="preserve">Technology: </w:t>
-            </w:r>
-            <w:r>
-              <w:rPr>
-                <w:color w:val="FFFFFF"/>
-                <w:sz w:val="19"/>
-              </w:rPr>
-              <w:t>Ollama · nomic-embed-text · ChromaDB</w:t>
+              <w:t>Technology: Ollama · nomic-embed-text · ChromaDB</w:t>
             </w:r>
           </w:p>
         </w:tc>
         <w:tc>
           <w:tcPr>
-            <w:tcW w:type="dxa" w:w="4320"/>
-            <w:shd w:val="clear" w:color="auto" w:fill="B31B1B"/>
+            <w:tcW w:type="dxa" w:w="4752"/>
+            <w:shd w:val="clear" w:fill="0D6EA6"/>
           </w:tcPr>
           <w:p>
+            <w:pPr>
+              <w:spacing w:after="0" w:before="0"/>
+            </w:pPr>
             <w:r>
               <w:rPr>
+                <w:rFonts w:ascii="Segoe UI" w:hAnsi="Segoe UI"/>
                 <w:b/>
                 <w:color w:val="FFFFFF"/>
-                <w:sz w:val="19"/>
+                <w:sz w:val="18"/>
               </w:rPr>
-              <w:t xml:space="preserve">Feature: </w:t>
-            </w:r>
-            <w:r>
-              <w:rPr>
-                <w:color w:val="FFFFFF"/>
-                <w:sz w:val="19"/>
-              </w:rPr>
-              <w:t>Semantic search + chat</w:t>
+              <w:t>Feature: Semantic search + chat</w:t>
             </w:r>
           </w:p>
         </w:tc>
@@ -804,8 +907,6 @@
       <w:r>
         <w:rPr>
           <w:b/>
-          <w:color w:val="B31B1B"/>
-          <w:sz w:val="19"/>
         </w:rPr>
         <w:t>ON SCREEN:</w:t>
       </w:r>
@@ -815,9 +916,7 @@
         <w:pStyle w:val="ListBullet"/>
       </w:pPr>
       <w:r>
-        <w:rPr>
-          <w:sz w:val="21"/>
-        </w:rPr>
+        <w:rPr/>
         <w:t>Every model call goes to a local Ollama model — 100% on the box</w:t>
       </w:r>
     </w:p>
@@ -826,9 +925,7 @@
         <w:pStyle w:val="ListBullet"/>
       </w:pPr>
       <w:r>
-        <w:rPr>
-          <w:sz w:val="21"/>
-        </w:rPr>
+        <w:rPr/>
         <w:t>nomic-embed-text builds 768-dim vectors stored in a local ChromaDB index</w:t>
       </w:r>
     </w:p>
@@ -837,9 +934,7 @@
         <w:pStyle w:val="ListBullet"/>
       </w:pPr>
       <w:r>
-        <w:rPr>
-          <w:sz w:val="21"/>
-        </w:rPr>
+        <w:rPr/>
         <w:t>Hybrid keyword + semantic retrieval solves the cryptic-name problem</w:t>
       </w:r>
     </w:p>
@@ -847,76 +942,62 @@
       <w:r>
         <w:rPr>
           <w:b/>
-          <w:color w:val="B31B1B"/>
-          <w:sz w:val="19"/>
         </w:rPr>
         <w:t>NARRATION:</w:t>
       </w:r>
     </w:p>
     <w:p>
-      <w:pPr>
-        <w:spacing w:after="120"/>
-      </w:pPr>
       <w:r>
         <w:rPr>
           <w:b/>
-          <w:color w:val="B31B1B"/>
         </w:rPr>
         <w:t xml:space="preserve">Ava:  </w:t>
       </w:r>
       <w:r>
+        <w:rPr/>
         <w:t>Now the intelligence. By default, every A-I call goes to a local Ollama model — running right on the machine, nothing leaves the box.</w:t>
       </w:r>
     </w:p>
     <w:p>
-      <w:pPr>
-        <w:spacing w:after="120"/>
-      </w:pPr>
       <w:r>
         <w:rPr>
           <w:b/>
-          <w:color w:val="B31B1B"/>
         </w:rPr>
         <w:t xml:space="preserve">Andrew:  </w:t>
       </w:r>
       <w:r>
+        <w:rPr/>
         <w:t>MapSnap embeds each table with the local nomic-embed-text model and stores those vectors in a ChromaDB index. At query time it blends keyword scoring with semantic matches.</w:t>
       </w:r>
     </w:p>
     <w:p>
-      <w:pPr>
-        <w:spacing w:after="120"/>
-      </w:pPr>
       <w:r>
         <w:rPr>
           <w:b/>
-          <w:color w:val="B31B1B"/>
         </w:rPr>
         <w:t xml:space="preserve">Ava:  </w:t>
       </w:r>
       <w:r>
+        <w:rPr/>
         <w:t>So when you ask, where are the checks, MapSnap finds the right table by meaning — even when it's called something cryptic like itemdata.</w:t>
       </w:r>
     </w:p>
-    <w:p/>
     <w:p>
       <w:pPr>
         <w:pStyle w:val="Heading1"/>
+        <w:pBdr>
+          <w:bottom w:val="single" w:sz="14" w:space="6" w:color="0D6EA6"/>
+        </w:pBdr>
       </w:pPr>
       <w:r>
         <w:t>Scene 6 — Plain English to SQL — safely</w:t>
       </w:r>
     </w:p>
     <w:p>
-      <w:pPr>
-        <w:spacing w:after="80"/>
-      </w:pPr>
       <w:r>
         <w:rPr>
           <w:b w:val="0"/>
           <w:i/>
-          <w:color w:val="666666"/>
-          <w:sz w:val="23"/>
         </w:rPr>
         <w:t>Draft, guard, and run locally</w:t>
       </w:r>
@@ -924,56 +1005,68 @@
     <w:tbl>
       <w:tblPr>
         <w:tblW w:type="auto" w:w="0"/>
+        <w:jc w:val="left"/>
         <w:tblLook w:firstColumn="1" w:firstRow="1" w:lastColumn="0" w:lastRow="0" w:noHBand="0" w:noVBand="1" w:val="04A0"/>
+        <w:tblBorders>
+          <w:top w:val="single" w:sz="8" w:color="0D6EA6"/>
+          <w:left w:val="none" w:sz="0" w:color="auto"/>
+          <w:bottom w:val="single" w:sz="8" w:color="C9D4DE"/>
+          <w:right w:val="none" w:sz="0" w:color="auto"/>
+          <w:insideH w:val="single" w:sz="4" w:color="C9D4DE"/>
+          <w:insideV w:val="none" w:sz="0" w:color="auto"/>
+        </w:tblBorders>
+        <w:tblCellMar>
+          <w:top w:w="40" w:type="dxa"/>
+          <w:left w:w="90" w:type="dxa"/>
+          <w:bottom w:w="40" w:type="dxa"/>
+          <w:right w:w="90" w:type="dxa"/>
+        </w:tblCellMar>
       </w:tblPr>
       <w:tblGrid>
-        <w:gridCol w:w="4320"/>
-        <w:gridCol w:w="4320"/>
+        <w:gridCol w:w="4752"/>
+        <w:gridCol w:w="4752"/>
       </w:tblGrid>
       <w:tr>
+        <w:trPr>
+          <w:tblHeader w:val="true"/>
+        </w:trPr>
         <w:tc>
           <w:tcPr>
-            <w:tcW w:type="dxa" w:w="4320"/>
-            <w:shd w:val="clear" w:color="auto" w:fill="B31B1B"/>
+            <w:tcW w:type="dxa" w:w="4752"/>
+            <w:shd w:val="clear" w:fill="0D6EA6"/>
           </w:tcPr>
           <w:p>
+            <w:pPr>
+              <w:spacing w:after="0" w:before="0"/>
+            </w:pPr>
             <w:r>
               <w:rPr>
+                <w:rFonts w:ascii="Segoe UI" w:hAnsi="Segoe UI"/>
                 <w:b/>
                 <w:color w:val="FFFFFF"/>
-                <w:sz w:val="19"/>
+                <w:sz w:val="18"/>
               </w:rPr>
-              <w:t xml:space="preserve">Technology: </w:t>
-            </w:r>
-            <w:r>
-              <w:rPr>
-                <w:color w:val="FFFFFF"/>
-                <w:sz w:val="19"/>
-              </w:rPr>
-              <w:t>Ollama NL→SQL · read-only guard</w:t>
+              <w:t>Technology: Ollama NL→SQL · read-only guard</w:t>
             </w:r>
           </w:p>
         </w:tc>
         <w:tc>
           <w:tcPr>
-            <w:tcW w:type="dxa" w:w="4320"/>
-            <w:shd w:val="clear" w:color="auto" w:fill="B31B1B"/>
+            <w:tcW w:type="dxa" w:w="4752"/>
+            <w:shd w:val="clear" w:fill="0D6EA6"/>
           </w:tcPr>
           <w:p>
+            <w:pPr>
+              <w:spacing w:after="0" w:before="0"/>
+            </w:pPr>
             <w:r>
               <w:rPr>
+                <w:rFonts w:ascii="Segoe UI" w:hAnsi="Segoe UI"/>
                 <w:b/>
                 <w:color w:val="FFFFFF"/>
-                <w:sz w:val="19"/>
+                <w:sz w:val="18"/>
               </w:rPr>
-              <w:t xml:space="preserve">Feature: </w:t>
-            </w:r>
-            <w:r>
-              <w:rPr>
-                <w:color w:val="FFFFFF"/>
-                <w:sz w:val="19"/>
-              </w:rPr>
-              <w:t>NL→SQL</w:t>
+              <w:t>Feature: NL→SQL</w:t>
             </w:r>
           </w:p>
         </w:tc>
@@ -988,8 +1081,6 @@
       <w:r>
         <w:rPr>
           <w:b/>
-          <w:color w:val="B31B1B"/>
-          <w:sz w:val="19"/>
         </w:rPr>
         <w:t>ON SCREEN:</w:t>
       </w:r>
@@ -999,9 +1090,7 @@
         <w:pStyle w:val="ListBullet"/>
       </w:pPr>
       <w:r>
-        <w:rPr>
-          <w:sz w:val="21"/>
-        </w:rPr>
+        <w:rPr/>
         <w:t>The model drafts SQL from your question</w:t>
       </w:r>
     </w:p>
@@ -1010,9 +1099,7 @@
         <w:pStyle w:val="ListBullet"/>
       </w:pPr>
       <w:r>
-        <w:rPr>
-          <w:sz w:val="21"/>
-        </w:rPr>
+        <w:rPr/>
         <w:t>A read-only guard rejects anything but SELECT and caps rows at 1,000</w:t>
       </w:r>
     </w:p>
@@ -1021,9 +1108,7 @@
         <w:pStyle w:val="ListBullet"/>
       </w:pPr>
       <w:r>
-        <w:rPr>
-          <w:sz w:val="21"/>
-        </w:rPr>
+        <w:rPr/>
         <w:t>Queries execute locally; result rows never leave the machine</w:t>
       </w:r>
     </w:p>
@@ -1031,76 +1116,62 @@
       <w:r>
         <w:rPr>
           <w:b/>
-          <w:color w:val="B31B1B"/>
-          <w:sz w:val="19"/>
         </w:rPr>
         <w:t>NARRATION:</w:t>
       </w:r>
     </w:p>
     <w:p>
-      <w:pPr>
-        <w:spacing w:after="120"/>
-      </w:pPr>
       <w:r>
         <w:rPr>
           <w:b/>
-          <w:color w:val="B31B1B"/>
         </w:rPr>
         <w:t xml:space="preserve">Andrew:  </w:t>
       </w:r>
       <w:r>
+        <w:rPr/>
         <w:t>Ask a question, and the local model drafts the S-Q-L for you.</w:t>
       </w:r>
     </w:p>
     <w:p>
-      <w:pPr>
-        <w:spacing w:after="120"/>
-      </w:pPr>
       <w:r>
         <w:rPr>
           <w:b/>
-          <w:color w:val="B31B1B"/>
         </w:rPr>
         <w:t xml:space="preserve">Ava:  </w:t>
       </w:r>
       <w:r>
+        <w:rPr/>
         <w:t>Before anything runs, a read-only guard rejects any statement that isn't a SELECT, and caps the result at a thousand rows — so you can't accidentally damage a production system.</w:t>
       </w:r>
     </w:p>
     <w:p>
-      <w:pPr>
-        <w:spacing w:after="120"/>
-      </w:pPr>
       <w:r>
         <w:rPr>
           <w:b/>
-          <w:color w:val="B31B1B"/>
         </w:rPr>
         <w:t xml:space="preserve">Andrew:  </w:t>
       </w:r>
       <w:r>
+        <w:rPr/>
         <w:t>The query runs locally, and the rows render locally. They never leave the building.</w:t>
       </w:r>
     </w:p>
-    <w:p/>
     <w:p>
       <w:pPr>
         <w:pStyle w:val="Heading1"/>
+        <w:pBdr>
+          <w:bottom w:val="single" w:sz="14" w:space="6" w:color="0D6EA6"/>
+        </w:pBdr>
       </w:pPr>
       <w:r>
         <w:t>Scene 7 — Compliance by construction</w:t>
       </w:r>
     </w:p>
     <w:p>
-      <w:pPr>
-        <w:spacing w:after="80"/>
-      </w:pPr>
       <w:r>
         <w:rPr>
           <w:b w:val="0"/>
           <w:i/>
-          <w:color w:val="666666"/>
-          <w:sz w:val="23"/>
         </w:rPr>
         <w:t>A single chokepoint for every cloud call</w:t>
       </w:r>
@@ -1108,56 +1179,68 @@
     <w:tbl>
       <w:tblPr>
         <w:tblW w:type="auto" w:w="0"/>
+        <w:jc w:val="left"/>
         <w:tblLook w:firstColumn="1" w:firstRow="1" w:lastColumn="0" w:lastRow="0" w:noHBand="0" w:noVBand="1" w:val="04A0"/>
+        <w:tblBorders>
+          <w:top w:val="single" w:sz="8" w:color="0D6EA6"/>
+          <w:left w:val="none" w:sz="0" w:color="auto"/>
+          <w:bottom w:val="single" w:sz="8" w:color="C9D4DE"/>
+          <w:right w:val="none" w:sz="0" w:color="auto"/>
+          <w:insideH w:val="single" w:sz="4" w:color="C9D4DE"/>
+          <w:insideV w:val="none" w:sz="0" w:color="auto"/>
+        </w:tblBorders>
+        <w:tblCellMar>
+          <w:top w:w="40" w:type="dxa"/>
+          <w:left w:w="90" w:type="dxa"/>
+          <w:bottom w:w="40" w:type="dxa"/>
+          <w:right w:w="90" w:type="dxa"/>
+        </w:tblCellMar>
       </w:tblPr>
       <w:tblGrid>
-        <w:gridCol w:w="4320"/>
-        <w:gridCol w:w="4320"/>
+        <w:gridCol w:w="4752"/>
+        <w:gridCol w:w="4752"/>
       </w:tblGrid>
       <w:tr>
+        <w:trPr>
+          <w:tblHeader w:val="true"/>
+        </w:trPr>
         <w:tc>
           <w:tcPr>
-            <w:tcW w:type="dxa" w:w="4320"/>
-            <w:shd w:val="clear" w:color="auto" w:fill="B31B1B"/>
+            <w:tcW w:type="dxa" w:w="4752"/>
+            <w:shd w:val="clear" w:fill="0D6EA6"/>
           </w:tcPr>
           <w:p>
+            <w:pPr>
+              <w:spacing w:after="0" w:before="0"/>
+            </w:pPr>
             <w:r>
               <w:rPr>
+                <w:rFonts w:ascii="Segoe UI" w:hAnsi="Segoe UI"/>
                 <w:b/>
                 <w:color w:val="FFFFFF"/>
-                <w:sz w:val="19"/>
+                <w:sz w:val="18"/>
               </w:rPr>
-              <w:t xml:space="preserve">Technology: </w:t>
-            </w:r>
-            <w:r>
-              <w:rPr>
-                <w:color w:val="FFFFFF"/>
-                <w:sz w:val="19"/>
-              </w:rPr>
-              <w:t>guardrail.py · per-profile data_policy</w:t>
+              <w:t>Technology: guardrail.py · per-profile data_policy</w:t>
             </w:r>
           </w:p>
         </w:tc>
         <w:tc>
           <w:tcPr>
-            <w:tcW w:type="dxa" w:w="4320"/>
-            <w:shd w:val="clear" w:color="auto" w:fill="B31B1B"/>
+            <w:tcW w:type="dxa" w:w="4752"/>
+            <w:shd w:val="clear" w:fill="0D6EA6"/>
           </w:tcPr>
           <w:p>
+            <w:pPr>
+              <w:spacing w:after="0" w:before="0"/>
+            </w:pPr>
             <w:r>
               <w:rPr>
+                <w:rFonts w:ascii="Segoe UI" w:hAnsi="Segoe UI"/>
                 <w:b/>
                 <w:color w:val="FFFFFF"/>
-                <w:sz w:val="19"/>
+                <w:sz w:val="18"/>
               </w:rPr>
-              <w:t xml:space="preserve">Feature: </w:t>
-            </w:r>
-            <w:r>
-              <w:rPr>
-                <w:color w:val="FFFFFF"/>
-                <w:sz w:val="19"/>
-              </w:rPr>
-              <w:t>Data governance</w:t>
+              <w:t>Feature: Data governance</w:t>
             </w:r>
           </w:p>
         </w:tc>
@@ -1172,8 +1255,6 @@
       <w:r>
         <w:rPr>
           <w:b/>
-          <w:color w:val="B31B1B"/>
-          <w:sz w:val="19"/>
         </w:rPr>
         <w:t>ON SCREEN:</w:t>
       </w:r>
@@ -1183,9 +1264,7 @@
         <w:pStyle w:val="ListBullet"/>
       </w:pPr>
       <w:r>
-        <w:rPr>
-          <w:sz w:val="21"/>
-        </w:rPr>
+        <w:rPr/>
         <w:t>Default policy is local_only — nothing leaves the machine</w:t>
       </w:r>
     </w:p>
@@ -1194,9 +1273,7 @@
         <w:pStyle w:val="ListBullet"/>
       </w:pPr>
       <w:r>
-        <w:rPr>
-          <w:sz w:val="21"/>
-        </w:rPr>
+        <w:rPr/>
         <w:t>cloud_metadata_only sends structure but scrubs every value</w:t>
       </w:r>
     </w:p>
@@ -1205,9 +1282,7 @@
         <w:pStyle w:val="ListBullet"/>
       </w:pPr>
       <w:r>
-        <w:rPr>
-          <w:sz w:val="21"/>
-        </w:rPr>
+        <w:rPr/>
         <w:t>Every decision is logged; regulated profiles lock until an admin agrees</w:t>
       </w:r>
     </w:p>
@@ -1215,76 +1290,62 @@
       <w:r>
         <w:rPr>
           <w:b/>
-          <w:color w:val="B31B1B"/>
-          <w:sz w:val="19"/>
         </w:rPr>
         <w:t>NARRATION:</w:t>
       </w:r>
     </w:p>
     <w:p>
-      <w:pPr>
-        <w:spacing w:after="120"/>
-      </w:pPr>
       <w:r>
         <w:rPr>
           <w:b/>
-          <w:color w:val="B31B1B"/>
         </w:rPr>
         <w:t xml:space="preserve">Ava:  </w:t>
       </w:r>
       <w:r>
+        <w:rPr/>
         <w:t>And this is the part compliance teams love. A single guardrail module is the only chokepoint for any cloud call.</w:t>
       </w:r>
     </w:p>
     <w:p>
-      <w:pPr>
-        <w:spacing w:after="120"/>
-      </w:pPr>
       <w:r>
         <w:rPr>
           <w:b/>
-          <w:color w:val="B31B1B"/>
         </w:rPr>
         <w:t xml:space="preserve">Andrew:  </w:t>
       </w:r>
       <w:r>
+        <w:rPr/>
         <w:t>The default policy is local-only — nothing leaves. If an admin raises it to cloud-metadata-only, the structure can go to a frontier model, but row values and samples are scrubbed in code — not by convention.</w:t>
       </w:r>
     </w:p>
     <w:p>
-      <w:pPr>
-        <w:spacing w:after="120"/>
-      </w:pPr>
       <w:r>
         <w:rPr>
           <w:b/>
-          <w:color w:val="B31B1B"/>
         </w:rPr>
         <w:t xml:space="preserve">Ava:  </w:t>
       </w:r>
       <w:r>
+        <w:rPr/>
         <w:t>Every decision is logged for audit, and a regulated profile stays locked until an administrator explicitly agrees. Compliance isn't bolted on — it's built in from day one.</w:t>
       </w:r>
     </w:p>
-    <w:p/>
     <w:p>
       <w:pPr>
         <w:pStyle w:val="Heading1"/>
+        <w:pBdr>
+          <w:bottom w:val="single" w:sz="14" w:space="6" w:color="0D6EA6"/>
+        </w:pBdr>
       </w:pPr>
       <w:r>
         <w:t>Scene 8 — Always-on, anywhere</w:t>
       </w:r>
     </w:p>
     <w:p>
-      <w:pPr>
-        <w:spacing w:after="80"/>
-      </w:pPr>
       <w:r>
         <w:rPr>
           <w:b w:val="0"/>
           <w:i/>
-          <w:color w:val="666666"/>
-          <w:sz w:val="23"/>
         </w:rPr>
         <w:t>Run as a service, reach it over a secure tunnel</w:t>
       </w:r>
@@ -1292,56 +1353,68 @@
     <w:tbl>
       <w:tblPr>
         <w:tblW w:type="auto" w:w="0"/>
+        <w:jc w:val="left"/>
         <w:tblLook w:firstColumn="1" w:firstRow="1" w:lastColumn="0" w:lastRow="0" w:noHBand="0" w:noVBand="1" w:val="04A0"/>
+        <w:tblBorders>
+          <w:top w:val="single" w:sz="8" w:color="0D6EA6"/>
+          <w:left w:val="none" w:sz="0" w:color="auto"/>
+          <w:bottom w:val="single" w:sz="8" w:color="C9D4DE"/>
+          <w:right w:val="none" w:sz="0" w:color="auto"/>
+          <w:insideH w:val="single" w:sz="4" w:color="C9D4DE"/>
+          <w:insideV w:val="none" w:sz="0" w:color="auto"/>
+        </w:tblBorders>
+        <w:tblCellMar>
+          <w:top w:w="40" w:type="dxa"/>
+          <w:left w:w="90" w:type="dxa"/>
+          <w:bottom w:w="40" w:type="dxa"/>
+          <w:right w:w="90" w:type="dxa"/>
+        </w:tblCellMar>
       </w:tblPr>
       <w:tblGrid>
-        <w:gridCol w:w="4320"/>
-        <w:gridCol w:w="4320"/>
+        <w:gridCol w:w="4752"/>
+        <w:gridCol w:w="4752"/>
       </w:tblGrid>
       <w:tr>
+        <w:trPr>
+          <w:tblHeader w:val="true"/>
+        </w:trPr>
         <w:tc>
           <w:tcPr>
-            <w:tcW w:type="dxa" w:w="4320"/>
-            <w:shd w:val="clear" w:color="auto" w:fill="B31B1B"/>
+            <w:tcW w:type="dxa" w:w="4752"/>
+            <w:shd w:val="clear" w:fill="0D6EA6"/>
           </w:tcPr>
           <w:p>
+            <w:pPr>
+              <w:spacing w:after="0" w:before="0"/>
+            </w:pPr>
             <w:r>
               <w:rPr>
+                <w:rFonts w:ascii="Segoe UI" w:hAnsi="Segoe UI"/>
                 <w:b/>
                 <w:color w:val="FFFFFF"/>
-                <w:sz w:val="19"/>
+                <w:sz w:val="18"/>
               </w:rPr>
-              <w:t xml:space="preserve">Technology: </w:t>
-            </w:r>
-            <w:r>
-              <w:rPr>
-                <w:color w:val="FFFFFF"/>
-                <w:sz w:val="19"/>
-              </w:rPr>
-              <w:t>NSSM · Cloudflare Tunnel</w:t>
+              <w:t>Technology: NSSM · Cloudflare Tunnel</w:t>
             </w:r>
           </w:p>
         </w:tc>
         <w:tc>
           <w:tcPr>
-            <w:tcW w:type="dxa" w:w="4320"/>
-            <w:shd w:val="clear" w:color="auto" w:fill="B31B1B"/>
+            <w:tcW w:type="dxa" w:w="4752"/>
+            <w:shd w:val="clear" w:fill="0D6EA6"/>
           </w:tcPr>
           <w:p>
+            <w:pPr>
+              <w:spacing w:after="0" w:before="0"/>
+            </w:pPr>
             <w:r>
               <w:rPr>
+                <w:rFonts w:ascii="Segoe UI" w:hAnsi="Segoe UI"/>
                 <w:b/>
                 <w:color w:val="FFFFFF"/>
-                <w:sz w:val="19"/>
+                <w:sz w:val="18"/>
               </w:rPr>
-              <w:t xml:space="preserve">Feature: </w:t>
-            </w:r>
-            <w:r>
-              <w:rPr>
-                <w:color w:val="FFFFFF"/>
-                <w:sz w:val="19"/>
-              </w:rPr>
-              <w:t>Operations</w:t>
+              <w:t>Feature: Operations</w:t>
             </w:r>
           </w:p>
         </w:tc>
@@ -1356,8 +1429,6 @@
       <w:r>
         <w:rPr>
           <w:b/>
-          <w:color w:val="B31B1B"/>
-          <w:sz w:val="19"/>
         </w:rPr>
         <w:t>ON SCREEN:</w:t>
       </w:r>
@@ -1367,9 +1438,7 @@
         <w:pStyle w:val="ListBullet"/>
       </w:pPr>
       <w:r>
-        <w:rPr>
-          <w:sz w:val="21"/>
-        </w:rPr>
+        <w:rPr/>
         <w:t>QI_MapSnap runs as an auto-start Windows service via NSSM</w:t>
       </w:r>
     </w:p>
@@ -1378,9 +1447,7 @@
         <w:pStyle w:val="ListBullet"/>
       </w:pPr>
       <w:r>
-        <w:rPr>
-          <w:sz w:val="21"/>
-        </w:rPr>
+        <w:rPr/>
         <w:t>A named Cloudflare tunnel gives a stable public HTTPS address</w:t>
       </w:r>
     </w:p>
@@ -1388,66 +1455,157 @@
       <w:r>
         <w:rPr>
           <w:b/>
-          <w:color w:val="B31B1B"/>
-          <w:sz w:val="19"/>
         </w:rPr>
         <w:t>NARRATION:</w:t>
       </w:r>
     </w:p>
     <w:p>
-      <w:pPr>
-        <w:spacing w:after="120"/>
-      </w:pPr>
       <w:r>
         <w:rPr>
           <w:b/>
-          <w:color w:val="B31B1B"/>
         </w:rPr>
         <w:t xml:space="preserve">Andrew:  </w:t>
       </w:r>
       <w:r>
+        <w:rPr/>
         <w:t>In production, MapSnap runs as an auto-start Windows service through NSSM, behind a named Cloudflare tunnel for a stable, secure public address.</w:t>
       </w:r>
     </w:p>
     <w:p>
-      <w:pPr>
-        <w:spacing w:after="120"/>
-      </w:pPr>
       <w:r>
         <w:rPr>
           <w:b/>
-          <w:color w:val="B31B1B"/>
         </w:rPr>
         <w:t xml:space="preserve">Ava:  </w:t>
       </w:r>
       <w:r>
+        <w:rPr/>
         <w:t>That's MapSnap — any database, born understood, with regulated data that never leaves the building. The same engine becomes CogniBase at Boston University.</w:t>
       </w:r>
     </w:p>
     <w:p>
-      <w:pPr>
-        <w:spacing w:after="120"/>
-      </w:pPr>
       <w:r>
         <w:rPr>
           <w:b/>
-          <w:color w:val="B31B1B"/>
         </w:rPr>
         <w:t xml:space="preserve">Andrew:  </w:t>
       </w:r>
       <w:r>
+        <w:rPr/>
         <w:t>Thanks for watching.</w:t>
       </w:r>
     </w:p>
-    <w:p/>
     <w:sectPr>
+      <w:headerReference w:type="default" r:id="rId9"/>
+      <w:footerReference w:type="default" r:id="rId10"/>
       <w:pgSz w:w="12240" w:h="15840"/>
-      <w:pgMar w:top="1440" w:right="1800" w:bottom="1440" w:left="1800" w:header="720" w:footer="720" w:gutter="0"/>
+      <w:pgMar w:top="1296" w:right="1368" w:bottom="1152" w:left="1368" w:header="720" w:footer="720" w:gutter="0"/>
       <w:cols w:space="720"/>
+      <w:titlePg/>
       <w:docGrid w:linePitch="360"/>
     </w:sectPr>
   </w:body>
 </w:document>
+</file>
+
+<file path=word/footer1.xml><?xml version="1.0" encoding="utf-8"?>
+<w:ftr xmlns:m="http://schemas.openxmlformats.org/officeDocument/2006/math" xmlns:mc="http://schemas.openxmlformats.org/markup-compatibility/2006" xmlns:mo="http://schemas.microsoft.com/office/mac/office/2008/main" xmlns:mv="urn:schemas-microsoft-com:mac:vml" xmlns:o="urn:schemas-microsoft-com:office:office" xmlns:r="http://schemas.openxmlformats.org/officeDocument/2006/relationships" xmlns:v="urn:schemas-microsoft-com:vml" xmlns:w10="urn:schemas-microsoft-com:office:word" xmlns:w14="http://schemas.microsoft.com/office/word/2010/wordml" xmlns:w="http://schemas.openxmlformats.org/wordprocessingml/2006/main" xmlns:wne="http://schemas.microsoft.com/office/word/2006/wordml" xmlns:wp14="http://schemas.microsoft.com/office/word/2010/wordprocessingDrawing" xmlns:wp="http://schemas.openxmlformats.org/drawingml/2006/wordprocessingDrawing" xmlns:wpc="http://schemas.microsoft.com/office/word/2010/wordprocessingCanvas" xmlns:wpg="http://schemas.microsoft.com/office/word/2010/wordprocessingGroup" xmlns:wpi="http://schemas.microsoft.com/office/word/2010/wordprocessingInk" xmlns:wps="http://schemas.microsoft.com/office/word/2010/wordprocessingShape" mc:Ignorable="w14 wp14">
+  <w:p>
+    <w:pPr>
+      <w:pStyle w:val="Footer"/>
+      <w:tabs>
+        <w:tab w:pos="9504" w:val="right"/>
+      </w:tabs>
+      <w:pBdr>
+        <w:top w:val="single" w:sz="6" w:space="4" w:color="C9D4DE"/>
+      </w:pBdr>
+    </w:pPr>
+    <w:r/>
+    <w:r>
+      <w:rPr>
+        <w:color w:val="64748B"/>
+        <w:sz w:val="17"/>
+      </w:rPr>
+      <w:t>Quiddity Innovations · Generated 2026-08-06</w:t>
+    </w:r>
+    <w:r>
+      <w:rPr>
+        <w:sz w:val="17"/>
+      </w:rPr>
+      <w:tab/>
+    </w:r>
+    <w:r>
+      <w:rPr>
+        <w:color w:val="64748B"/>
+        <w:sz w:val="17"/>
+      </w:rPr>
+      <w:t xml:space="preserve">Page </w:t>
+    </w:r>
+    <w:fldSimple w:instr="PAGE">
+      <w:r>
+        <w:rPr>
+          <w:rFonts w:ascii="Calibri" w:hAnsi="Calibri"/>
+          <w:sz w:val="17"/>
+          <w:color w:val="0A5580"/>
+          <w:b/>
+        </w:rPr>
+        <w:t>1</w:t>
+      </w:r>
+    </w:fldSimple>
+    <w:r>
+      <w:rPr>
+        <w:color w:val="64748B"/>
+        <w:sz w:val="17"/>
+      </w:rPr>
+      <w:t xml:space="preserve"> of </w:t>
+    </w:r>
+    <w:fldSimple w:instr="NUMPAGES">
+      <w:r>
+        <w:rPr>
+          <w:rFonts w:ascii="Calibri" w:hAnsi="Calibri"/>
+          <w:sz w:val="17"/>
+          <w:color w:val="64748B"/>
+        </w:rPr>
+        <w:t>1</w:t>
+      </w:r>
+    </w:fldSimple>
+  </w:p>
+</w:ftr>
+</file>
+
+<file path=word/header1.xml><?xml version="1.0" encoding="utf-8"?>
+<w:hdr xmlns:m="http://schemas.openxmlformats.org/officeDocument/2006/math" xmlns:mc="http://schemas.openxmlformats.org/markup-compatibility/2006" xmlns:mo="http://schemas.microsoft.com/office/mac/office/2008/main" xmlns:mv="urn:schemas-microsoft-com:mac:vml" xmlns:o="urn:schemas-microsoft-com:office:office" xmlns:r="http://schemas.openxmlformats.org/officeDocument/2006/relationships" xmlns:v="urn:schemas-microsoft-com:vml" xmlns:w10="urn:schemas-microsoft-com:office:word" xmlns:w14="http://schemas.microsoft.com/office/word/2010/wordml" xmlns:w="http://schemas.openxmlformats.org/wordprocessingml/2006/main" xmlns:wne="http://schemas.microsoft.com/office/word/2006/wordml" xmlns:wp14="http://schemas.microsoft.com/office/word/2010/wordprocessingDrawing" xmlns:wp="http://schemas.openxmlformats.org/drawingml/2006/wordprocessingDrawing" xmlns:wpc="http://schemas.microsoft.com/office/word/2010/wordprocessingCanvas" xmlns:wpg="http://schemas.microsoft.com/office/word/2010/wordprocessingGroup" xmlns:wpi="http://schemas.microsoft.com/office/word/2010/wordprocessingInk" xmlns:wps="http://schemas.microsoft.com/office/word/2010/wordprocessingShape" mc:Ignorable="w14 wp14">
+  <w:p>
+    <w:pPr>
+      <w:pStyle w:val="Header"/>
+      <w:tabs>
+        <w:tab w:pos="9504" w:val="right"/>
+      </w:tabs>
+      <w:pBdr>
+        <w:bottom w:val="single" w:sz="6" w:space="4" w:color="C9D4DE"/>
+      </w:pBdr>
+    </w:pPr>
+    <w:r/>
+    <w:r>
+      <w:rPr>
+        <w:rFonts w:ascii="Segoe UI" w:hAnsi="Segoe UI"/>
+        <w:b/>
+        <w:color w:val="0A5580"/>
+        <w:sz w:val="17"/>
+      </w:rPr>
+      <w:t>MapSnap — Explainer Video Script</w:t>
+    </w:r>
+    <w:r>
+      <w:rPr>
+        <w:rFonts w:ascii="Calibri" w:hAnsi="Calibri"/>
+        <w:color w:val="64748B"/>
+        <w:sz w:val="17"/>
+      </w:rPr>
+      <w:tab/>
+      <w:t>QI Hive · Project Documentation Library</w:t>
+    </w:r>
+  </w:p>
+</w:hdr>
 </file>
 
 <file path=word/numbering.xml><?xml version="1.0" encoding="utf-8"?>
@@ -1813,9 +1971,13 @@
     <w:name w:val="Normal"/>
     <w:qFormat/>
     <w:rsid w:val="00FC693F"/>
+    <w:pPr>
+      <w:spacing w:after="120" w:line="269" w:lineRule="auto"/>
+    </w:pPr>
     <w:rPr>
       <w:rFonts w:ascii="Calibri" w:hAnsi="Calibri"/>
-      <w:sz w:val="22"/>
+      <w:color w:val="1F2937"/>
+      <w:sz w:val="21"/>
     </w:rPr>
   </w:style>
   <w:style w:type="paragraph" w:styleId="Header">
@@ -1873,15 +2035,16 @@
     <w:pPr>
       <w:keepNext/>
       <w:keepLines/>
-      <w:spacing w:before="480" w:after="0"/>
+      <w:spacing w:before="360" w:after="160"/>
       <w:outlineLvl w:val="0"/>
     </w:pPr>
     <w:rPr>
-      <w:rFonts w:asciiTheme="majorHAnsi" w:eastAsiaTheme="majorEastAsia" w:hAnsiTheme="majorHAnsi" w:cstheme="majorBidi"/>
+      <w:rFonts w:asciiTheme="majorHAnsi" w:eastAsiaTheme="majorEastAsia" w:hAnsiTheme="majorHAnsi" w:cstheme="majorBidi" w:ascii="Segoe UI" w:hAnsi="Segoe UI"/>
       <w:b/>
       <w:bCs/>
-      <w:color w:val="365F91" w:themeColor="accent1" w:themeShade="BF"/>
-      <w:sz w:val="28"/>
+      <w:i w:val="0"/>
+      <w:color w:val="1F2937"/>
+      <w:sz w:val="40"/>
       <w:szCs w:val="28"/>
     </w:rPr>
   </w:style>
@@ -1897,15 +2060,16 @@
     <w:pPr>
       <w:keepNext/>
       <w:keepLines/>
-      <w:spacing w:before="200" w:after="0"/>
+      <w:spacing w:before="280" w:after="100"/>
       <w:outlineLvl w:val="1"/>
     </w:pPr>
     <w:rPr>
-      <w:rFonts w:asciiTheme="majorHAnsi" w:eastAsiaTheme="majorEastAsia" w:hAnsiTheme="majorHAnsi" w:cstheme="majorBidi"/>
+      <w:rFonts w:asciiTheme="majorHAnsi" w:eastAsiaTheme="majorEastAsia" w:hAnsiTheme="majorHAnsi" w:cstheme="majorBidi" w:ascii="Segoe UI" w:hAnsi="Segoe UI"/>
       <w:b/>
       <w:bCs/>
-      <w:color w:val="4F81BD" w:themeColor="accent1"/>
-      <w:sz w:val="26"/>
+      <w:i w:val="0"/>
+      <w:color w:val="0A5580"/>
+      <w:sz w:val="27"/>
       <w:szCs w:val="26"/>
     </w:rPr>
   </w:style>
@@ -1921,14 +2085,16 @@
     <w:pPr>
       <w:keepNext/>
       <w:keepLines/>
-      <w:spacing w:before="200" w:after="0"/>
+      <w:spacing w:before="200" w:after="80"/>
       <w:outlineLvl w:val="2"/>
     </w:pPr>
     <w:rPr>
-      <w:rFonts w:asciiTheme="majorHAnsi" w:eastAsiaTheme="majorEastAsia" w:hAnsiTheme="majorHAnsi" w:cstheme="majorBidi"/>
+      <w:rFonts w:asciiTheme="majorHAnsi" w:eastAsiaTheme="majorEastAsia" w:hAnsiTheme="majorHAnsi" w:cstheme="majorBidi" w:ascii="Segoe UI" w:hAnsi="Segoe UI"/>
       <w:b/>
       <w:bCs/>
-      <w:color w:val="4F81BD" w:themeColor="accent1"/>
+      <w:i w:val="0"/>
+      <w:color w:val="1F2937"/>
+      <w:sz w:val="22"/>
     </w:rPr>
   </w:style>
   <w:style w:type="paragraph" w:styleId="Heading4">

</xml_diff>